<commit_message>
Add configuration file for project settings and directories
- Created config.json to define paths for offers and output directory
- Set window geometry and appearance preferences
- Included order settings for file handling
</commit_message>
<xml_diff>
--- a/Manual - ActualizarPrecios.docx
+++ b/Manual - ActualizarPrecios.docx
@@ -43,7 +43,7 @@
           <w:color w:val="787878"/>
           <w:sz w:val="24"/>
         </w:rPr>
-        <w:t>Versión 1.0 — September 2026</w:t>
+        <w:t>Versión 1.0 — October 2026</w:t>
       </w:r>
     </w:p>
     <w:p/>
@@ -628,12 +628,17 @@
     </w:p>
     <w:p>
       <w:r>
-        <w:t>Al seleccionar el directorio de ofertas, la herramienta lista automáticamente todos los archivos .xlsx encontrados (ignora archivos temporales que empiezan con ~$). La tabla está agrupada por comercializadora: cada fila en negrita es una comercializadora y debajo están sus archivos. Se puede hacer clic en la flecha del grupo para plegarlo o desplegarlo.</w:t>
+        <w:t>Al seleccionar el directorio de ofertas, la herramienta lista automáticamente todos los archivos .xlsx encontrados (ignora archivos temporales que empiezan con ~$). La tabla tiene UNA FILA POR ARCHIVO de oferta: no se agrupan los archivos de la misma comercializadora.</w:t>
       </w:r>
     </w:p>
     <w:p>
       <w:r>
-        <w:t>Sobre la tabla hay un cuadro de búsqueda. Escribir texto filtra al instante por nombre de archivo o de comercializadora, y al limpiarlo vuelven a mostrarse todos los grupos (que se despliegan automáticamente mientras haya un filtro activo). Haciendo clic en la cabecera de una columna se alterna el orden ascendente/descendente.</w:t>
+        <w:t>Sobre la tabla hay un cuadro de búsqueda. Escribir texto filtra al instante por nombre de archivo o de comercializadora, y al limpiarlo vuelven a mostrarse todos los archivos. Haciendo clic en la cabecera de una columna se alterna el orden ascendente/descendente.</w:t>
+      </w:r>
+    </w:p>
+    <w:p>
+      <w:r>
+        <w:t>Si delante de una comercializadora aparece ⚠ significa que hay otro archivo con la misma. En el Excel final solo puede haber una fila por comercializadora, por lo que hay que cambiar la comercializadora de uno de los archivos (ver sección 3.4).</w:t>
       </w:r>
     </w:p>
     <w:tbl>
@@ -796,7 +801,7 @@
               <w:rPr>
                 <w:sz w:val="18"/>
               </w:rPr>
-              <w:t>Comercializadora del grupo al que pertenece el archivo. Se auto-detecta según el nombre.</w:t>
+              <w:t>Comercializadora del archivo. Se auto-detecta según el nombre y se puede cambiar con el desplegable. Si se repite, aparece precedida de ⚠.</w:t>
             </w:r>
           </w:p>
         </w:tc>
@@ -837,7 +842,7 @@
               <w:rPr>
                 <w:sz w:val="18"/>
               </w:rPr>
-              <w:t>Si la oferta es renovable o no. Solo se edita en la fila del grupo.</w:t>
+              <w:t>Si la oferta es renovable o no.</w:t>
             </w:r>
           </w:p>
         </w:tc>
@@ -932,7 +937,7 @@
               <w:rPr>
                 <w:sz w:val="18"/>
               </w:rPr>
-              <w:t>Vacía</w:t>
+              <w:t>Fin del mismo mes del año siguiente (02/10/2026 → 31/10/2027)</w:t>
             </w:r>
           </w:p>
         </w:tc>
@@ -1035,7 +1040,7 @@
         <w:pStyle w:val="ListBullet"/>
       </w:pPr>
       <w:r>
-        <w:t>Comercializadora (fila de un archivo): abre un desplegable con la lista de comercializadoras conocidas. Al confirmar, el archivo se mueve al grupo de la comercializadora elegida y se crea el grupo si es nueva.</w:t>
+        <w:t>Comercializadora: abre un desplegable con la lista de comercializadoras conocidas. Cada archivo tiene la suya propia; no hay grupos.</w:t>
       </w:r>
     </w:p>
     <w:p>
@@ -1043,7 +1048,7 @@
         <w:pStyle w:val="ListBullet"/>
       </w:pPr>
       <w:r>
-        <w:t>Renovable (fila del grupo): abre un desplegable con los valores "No" y "Si".</w:t>
+        <w:t>Renovable: abre un desplegable con los valores "No" y "Si".</w:t>
       </w:r>
     </w:p>
     <w:p>
@@ -1051,12 +1056,17 @@
         <w:pStyle w:val="ListBullet"/>
       </w:pPr>
       <w:r>
-        <w:t>Fechas Recibida, Vencimiento y Validez (fila del grupo): abren un calendario con los botones Aceptar, Limpiar y Cancelar, además de la navegación entre meses. "Aceptar" aplica el día marcado, "Limpiar" deja la fecha vacía y "Cancelar" cierra el calendario sin cambiar nada.</w:t>
+        <w:t>Fechas Recibida, Vencimiento y Validez: abren una caja donde se puede escribir o pegar la fecha (p. ej. 01/04/2027, 2027-05-31, 30.06.27). Un botón 📅 junto a la caja abre el calendario con los botones Aceptar, Limpiar y Cancelar, además de la navegación entre meses.</w:t>
       </w:r>
     </w:p>
     <w:p>
       <w:r>
-        <w:t>Con el teclado: Intro o doble clic abre el editor de la celda enfocada, las flechas recorren las celdas y Esc o un clic fuera cierra el editor sin cambios.</w:t>
+        <w:t>En el editor de fecha: Intro acepta lo escrito, Tab acepta y baja a la fila siguiente (Shift+Tab a la anterior) y Esc deja la celda como estaba.</w:t>
+      </w:r>
+    </w:p>
+    <w:p>
+      <w:r>
+        <w:t>Copiar y pegar: Ctrl+C copia la fila enfocada al portapapeles y Ctrl+V la pega en la fila enfocada. Si el portapapeles trae las tres fechas separadas por tabulador (por ejemplo, copiadas de Excel), se rellenan Recibida, Vencimiento y Validez a la vez. Si solo hay una fecha, se aplica a la columna de fecha enfocada.</w:t>
       </w:r>
     </w:p>
     <w:p>
@@ -1068,7 +1078,7 @@
         <w:t xml:space="preserve">Importante: </w:t>
       </w:r>
       <w:r>
-        <w:t>Las fechas y la comercializadora se asignan por comercializadora, no por archivo. Si hay varias ofertas de la misma comercializadora, se aplicarán las mismas fechas a todas.</w:t>
+        <w:t>En el Excel final solo puede haber una fila por comercializadora. Si dos archivos comparten comercializadora (aparece ⚠), hay que cambiar la de uno de ellos antes de procesar; de lo contrario la herramienta lo avisará y usará la primera fila por orden alfabético de archivo.</w:t>
       </w:r>
     </w:p>
     <w:p>
@@ -1396,6 +1406,64 @@
                 <w:rFonts w:ascii="Consolas" w:hAnsi="Consolas"/>
                 <w:sz w:val="18"/>
               </w:rPr>
+              <w:t>Ctrl + C</w:t>
+            </w:r>
+          </w:p>
+        </w:tc>
+        <w:tc>
+          <w:tcPr>
+            <w:tcW w:type="dxa" w:w="4320"/>
+          </w:tcPr>
+          <w:p>
+            <w:r>
+              <w:rPr>
+                <w:sz w:val="18"/>
+              </w:rPr>
+              <w:t>Copiar la fila enfocada al portapapeles.</w:t>
+            </w:r>
+          </w:p>
+        </w:tc>
+      </w:tr>
+      <w:tr>
+        <w:tc>
+          <w:tcPr>
+            <w:tcW w:type="dxa" w:w="4320"/>
+          </w:tcPr>
+          <w:p>
+            <w:r>
+              <w:rPr>
+                <w:rFonts w:ascii="Consolas" w:hAnsi="Consolas"/>
+                <w:sz w:val="18"/>
+              </w:rPr>
+              <w:t>Ctrl + V</w:t>
+            </w:r>
+          </w:p>
+        </w:tc>
+        <w:tc>
+          <w:tcPr>
+            <w:tcW w:type="dxa" w:w="4320"/>
+          </w:tcPr>
+          <w:p>
+            <w:r>
+              <w:rPr>
+                <w:sz w:val="18"/>
+              </w:rPr>
+              <w:t>Pegar en la fila enfocada (fechas, comercializadora y renovable).</w:t>
+            </w:r>
+          </w:p>
+        </w:tc>
+      </w:tr>
+      <w:tr>
+        <w:tc>
+          <w:tcPr>
+            <w:tcW w:type="dxa" w:w="4320"/>
+          </w:tcPr>
+          <w:p>
+            <w:r>
+              <w:rPr>
+                <w:rFonts w:ascii="Consolas" w:hAnsi="Consolas"/>
+                <w:sz w:val="18"/>
+              </w:rPr>
               <w:t>Ctrl + L</w:t>
             </w:r>
           </w:p>
@@ -1438,7 +1506,36 @@
               <w:rPr>
                 <w:sz w:val="18"/>
               </w:rPr>
-              <w:t>Procesar; sobre una celda abre su editor.</w:t>
+              <w:t>Procesar; sobre una celda abre su editor; en el editor de fecha, confirmar.</w:t>
+            </w:r>
+          </w:p>
+        </w:tc>
+      </w:tr>
+      <w:tr>
+        <w:tc>
+          <w:tcPr>
+            <w:tcW w:type="dxa" w:w="4320"/>
+          </w:tcPr>
+          <w:p>
+            <w:r>
+              <w:rPr>
+                <w:rFonts w:ascii="Consolas" w:hAnsi="Consolas"/>
+                <w:sz w:val="18"/>
+              </w:rPr>
+              <w:t>Tab</w:t>
+            </w:r>
+          </w:p>
+        </w:tc>
+        <w:tc>
+          <w:tcPr>
+            <w:tcW w:type="dxa" w:w="4320"/>
+          </w:tcPr>
+          <w:p>
+            <w:r>
+              <w:rPr>
+                <w:sz w:val="18"/>
+              </w:rPr>
+              <w:t>En el editor de fecha, confirmar y saltar a la fila siguiente (Shift+Tab, a la anterior).</w:t>
             </w:r>
           </w:p>
         </w:tc>
@@ -1554,7 +1651,7 @@
               <w:rPr>
                 <w:sz w:val="18"/>
               </w:rPr>
-              <w:t>Cerrar el editor o el calendario sin guardar.</w:t>
+              <w:t>Cerrar el editor o el calendario sin guardar; cancelar el proceso en curso.</w:t>
             </w:r>
           </w:p>
         </w:tc>

</xml_diff>

<commit_message>
Process duplicate retailer offers independently
Keep each source file's prices and dates as a separate offer, and update the default validity date and generated artifacts.

Co-authored-by: Copilot <223556219+Copilot@users.noreply.github.com>
</commit_message>
<xml_diff>
--- a/Manual - ActualizarPrecios.docx
+++ b/Manual - ActualizarPrecios.docx
@@ -636,11 +636,6 @@
         <w:t>Sobre la tabla hay un cuadro de búsqueda. Escribir texto filtra al instante por nombre de archivo o de comercializadora, y al limpiarlo vuelven a mostrarse todos los archivos. Haciendo clic en la cabecera de una columna se alterna el orden ascendente/descendente.</w:t>
       </w:r>
     </w:p>
-    <w:p>
-      <w:r>
-        <w:t>Si delante de una comercializadora aparece ⚠ significa que hay otro archivo con la misma. En el Excel final solo puede haber una fila por comercializadora, por lo que hay que cambiar la comercializadora de uno de los archivos (ver sección 3.4).</w:t>
-      </w:r>
-    </w:p>
     <w:tbl>
       <w:tblPr>
         <w:tblStyle w:val="LightGrid-Accent1"/>
@@ -801,7 +796,7 @@
               <w:rPr>
                 <w:sz w:val="18"/>
               </w:rPr>
-              <w:t>Comercializadora del archivo. Se auto-detecta según el nombre y se puede cambiar con el desplegable. Si se repite, aparece precedida de ⚠.</w:t>
+              <w:t>Comercializadora del archivo. Se auto-detecta según el nombre y se puede cambiar con el desplegable. Puede repetirse en varios archivos.</w:t>
             </w:r>
           </w:p>
         </w:tc>
@@ -978,7 +973,7 @@
               <w:rPr>
                 <w:sz w:val="18"/>
               </w:rPr>
-              <w:t>Vacía</w:t>
+              <w:t>Viernes de esta semana (07/10/2026 → 09/10/2026)</w:t>
             </w:r>
           </w:p>
         </w:tc>
@@ -1078,7 +1073,7 @@
         <w:t xml:space="preserve">Importante: </w:t>
       </w:r>
       <w:r>
-        <w:t>En el Excel final solo puede haber una fila por comercializadora. Si dos archivos comparten comercializadora (aparece ⚠), hay que cambiar la de uno de ellos antes de procesar; de lo contrario la herramienta lo avisará y usará la primera fila por orden alfabético de archivo.</w:t>
+        <w:t>Cada archivo de oferta se procesa de forma independiente, incluso si comparte comercializadora con otro. En el Excel pueden aparecer varias filas con la misma comercializadora; cada una conserva los precios y fechas de su archivo de origen.</w:t>
       </w:r>
     </w:p>
     <w:p>

</xml_diff>